<commit_message>
update template for kadis penanaman modal
</commit_message>
<xml_diff>
--- a/public/templates/kkprb/6_FORMAT_PERSETUJUAN_KKPRB.docx
+++ b/public/templates/kkprb/6_FORMAT_PERSETUJUAN_KKPRB.docx
@@ -1425,7 +1425,13 @@
               <w:rPr>
                 <w:u w:val="single"/>
               </w:rPr>
-              <w:t>Ir. H. Amiruddin, M.Si.</w:t>
+              <w:t>H. Novian Rosmana, S.Sos</w:t>
+            </w:r>
+            <w:r>
+              <w:rPr>
+                <w:u w:val="single"/>
+              </w:rPr>
+              <w:t>.</w:t>
             </w:r>
           </w:p>
           <w:p>
@@ -1434,7 +1440,10 @@
               <w:ind w:left="247"/>
             </w:pPr>
             <w:r>
-              <w:t>NIP. 19651030 199403 1 007</w:t>
+              <w:t xml:space="preserve">NIP. </w:t>
+            </w:r>
+            <w:r>
+              <w:t>197811162006041011</w:t>
             </w:r>
           </w:p>
           <w:p>
@@ -2200,6 +2209,7 @@
           <w:sz w:val="24"/>
           <w:szCs w:val="24"/>
         </w:rPr>
+        <w:lastRenderedPageBreak/>
         <w:t>LAMPIRAN</w:t>
       </w:r>
     </w:p>

</xml_diff>

<commit_message>
update nama kadis Perizinan
</commit_message>
<xml_diff>
--- a/public/templates/kkprb/6_FORMAT_PERSETUJUAN_KKPRB.docx
+++ b/public/templates/kkprb/6_FORMAT_PERSETUJUAN_KKPRB.docx
@@ -1426,12 +1426,6 @@
                 <w:u w:val="single"/>
               </w:rPr>
               <w:t>H. Novian Rosmana, S.Sos</w:t>
-            </w:r>
-            <w:r>
-              <w:rPr>
-                <w:u w:val="single"/>
-              </w:rPr>
-              <w:t>.</w:t>
             </w:r>
           </w:p>
           <w:p>

</xml_diff>